<commit_message>
Stage 2 templates: polished branded .docx, drop fragile PDFs, expand FAQ
- Restyle the D1-D4 .docx via a custom pandoc reference: UBI running header,
  brand-blue title/headings, blue-bar callout blocks, clean body + code blocks.
- Strip emoji/box-rule artifacts from template sources.
- Remove the badly-rendered .pdf previews; .docx is the editable artifact
  (export-to-PDF from Docs/Word gives a clean PDF if wanted).
- FAQ: docx-only download, plus 'How to nail each deliverable' (D1-D4) and a
  Stage 2 Q&A covering how to submit, the 75-word summary, proof-of-work,
  reflected vs stored XSS, the Redis/Elasticsearch trap, attacker IP, CVSS.

Co-Authored-By: Claude Opus 4.8 (1M context) <noreply@anthropic.com>
</commit_message>
<xml_diff>
--- a/public/capstone/stage-2/stage-2-d1-recon-template.docx
+++ b/public/capstone/stage-2/stage-2-d1-recon-template.docx
@@ -105,12 +105,6 @@
       <w:pPr>
         <w:pStyle w:val="BlockText"/>
       </w:pPr>
-      <w:r>
-        <w:t xml:space="preserve">📋</w:t>
-      </w:r>
-      <w:r>
-        <w:t xml:space="preserve"> </w:t>
-      </w:r>
       <w:r>
         <w:rPr>
           <w:b/>
@@ -274,7 +268,7 @@
         <w:pStyle w:val="Heading2"/>
       </w:pPr>
       <w:r>
-        <w:t xml:space="preserve">── Page 1 — Title and methodology ──</w:t>
+        <w:t xml:space="preserve">Page 1 — Title and methodology</w:t>
       </w:r>
     </w:p>
     <w:p>
@@ -620,12 +614,6 @@
       <w:pPr>
         <w:pStyle w:val="BlockText"/>
       </w:pPr>
-      <w:r>
-        <w:t xml:space="preserve">📋</w:t>
-      </w:r>
-      <w:r>
-        <w:t xml:space="preserve"> </w:t>
-      </w:r>
       <w:r>
         <w:rPr>
           <w:b/>
@@ -727,7 +715,7 @@
         <w:pStyle w:val="Heading2"/>
       </w:pPr>
       <w:r>
-        <w:t xml:space="preserve">── Pages 2–4 — The reconstruction ──</w:t>
+        <w:t xml:space="preserve">Pages 2–4 — The reconstruction</w:t>
       </w:r>
     </w:p>
     <w:bookmarkStart w:id="14" w:name="X71aa974831f53d0ff99e01f841660179be93f7c"/>
@@ -1661,12 +1649,6 @@
         <w:pStyle w:val="BlockText"/>
       </w:pPr>
       <w:r>
-        <w:t xml:space="preserve">📋</w:t>
-      </w:r>
-      <w:r>
-        <w:t xml:space="preserve"> </w:t>
-      </w:r>
-      <w:r>
         <w:rPr>
           <w:b/>
           <w:bCs/>
@@ -1794,7 +1776,7 @@
         <w:pStyle w:val="Heading2"/>
       </w:pPr>
       <w:r>
-        <w:t xml:space="preserve">── Page 5 — The three conclusions ──</w:t>
+        <w:t xml:space="preserve">Page 5 — The three conclusions</w:t>
       </w:r>
     </w:p>
     <w:p>
@@ -2690,6 +2672,7 @@
     </w:p>
     <w:bookmarkEnd w:id="22"/>
     <w:sectPr>
+      <w:headerReference r:id="rIdUBIHdr" w:type="default"/>
       <w:footnotePr>
         <w:numRestart w:val="eachSect"/>
       </w:footnotePr>
@@ -2719,6 +2702,40 @@
     </w:p>
   </w:footnote>
 </w:footnotes>
+</file>
+
+<file path=word/header1.xml><?xml version="1.0" encoding="utf-8"?>
+<w:hdr xmlns:w="http://schemas.openxmlformats.org/wordprocessingml/2006/main" xmlns:r="http://schemas.openxmlformats.org/officeDocument/2006/relationships">
+  <w:p>
+    <w:pPr>
+      <w:pBdr>
+        <w:bottom w:val="single" w:sz="6" w:space="4" w:color="CBD5E1"/>
+      </w:pBdr>
+      <w:spacing w:after="0"/>
+      <w:tabs>
+        <w:tab w:val="right" w:pos="9360"/>
+      </w:tabs>
+    </w:pPr>
+    <w:r>
+      <w:rPr>
+        <w:rFonts w:ascii="Calibri" w:hAnsi="Calibri"/>
+        <w:b/>
+        <w:color w:val="1E40AF"/>
+        <w:sz w:val="18"/>
+      </w:rPr>
+      <w:t xml:space="preserve">UBUNTU BRIDGE INITIATIVE</w:t>
+    </w:r>
+    <w:r>
+      <w:rPr>
+        <w:rFonts w:ascii="Calibri" w:hAnsi="Calibri"/>
+        <w:color w:val="64748B"/>
+        <w:sz w:val="18"/>
+      </w:rPr>
+      <w:tab/>
+      <w:t xml:space="preserve">Cybersecurity Internship  ·  Cohort 1  ·  Stage 2 Capstone</w:t>
+    </w:r>
+  </w:p>
+</w:hdr>
 </file>
 
 <file path=word/numbering.xml><?xml version="1.0" encoding="utf-8"?>
@@ -3074,6 +3091,15 @@
   <w:style w:default="1" w:styleId="Normal" w:type="paragraph">
     <w:name w:val="Normal"/>
     <w:qFormat/>
+    <w:rPr>
+      <w:rFonts w:ascii="Calibri" w:hAnsi="Calibri"/>
+      <w:color w:val="111827"/>
+      <w:sz w:val="22"/>
+      <w:szCs w:val="22"/>
+    </w:rPr>
+    <w:pPr>
+      <w:spacing w:after="140" w:line="276" w:lineRule="auto"/>
+    </w:pPr>
   </w:style>
   <w:style w:styleId="BodyText" w:type="paragraph">
     <w:name w:val="Body Text"/>
@@ -3115,6 +3141,11 @@
       <w:rFonts w:asciiTheme="majorHAnsi" w:cstheme="majorBidi" w:eastAsiaTheme="majorEastAsia" w:hAnsiTheme="majorHAnsi"/>
       <w:sz w:val="56"/>
       <w:szCs w:val="56"/>
+      <w:rFonts w:ascii="Calibri" w:hAnsi="Calibri"/>
+      <w:color w:val="1E40AF"/>
+      <w:sz w:val="46"/>
+      <w:szCs w:val="46"/>
+      <w:spacing w:val="-6"/>
     </w:rPr>
   </w:style>
   <w:style w:customStyle="1" w:styleId="TitleChar" w:type="character">
@@ -3250,6 +3281,10 @@
       <w:color w:themeColor="accent1" w:themeShade="BF" w:val="0F4761"/>
       <w:sz w:val="40"/>
       <w:szCs w:val="40"/>
+      <w:rFonts w:ascii="Calibri" w:hAnsi="Calibri"/>
+      <w:color w:val="1E40AF"/>
+      <w:sz w:val="32"/>
+      <w:szCs w:val="32"/>
     </w:rPr>
   </w:style>
   <w:style w:styleId="Heading2" w:type="paragraph">
@@ -3273,6 +3308,10 @@
       <w:color w:themeColor="accent1" w:themeShade="BF" w:val="0F4761"/>
       <w:sz w:val="32"/>
       <w:szCs w:val="32"/>
+      <w:rFonts w:ascii="Calibri" w:hAnsi="Calibri"/>
+      <w:color w:val="1E40AF"/>
+      <w:sz w:val="26"/>
+      <w:szCs w:val="26"/>
     </w:rPr>
   </w:style>
   <w:style w:styleId="Heading3" w:type="paragraph">
@@ -3296,6 +3335,11 @@
       <w:color w:themeColor="accent1" w:themeShade="BF" w:val="0F4761"/>
       <w:sz w:val="28"/>
       <w:szCs w:val="28"/>
+      <w:rFonts w:ascii="Calibri" w:hAnsi="Calibri"/>
+      <w:color w:val="0F172A"/>
+      <w:b/>
+      <w:sz w:val="23"/>
+      <w:szCs w:val="23"/>
     </w:rPr>
   </w:style>
   <w:style w:styleId="Heading4" w:type="paragraph">
@@ -3559,7 +3603,14 @@
     <w:pPr>
       <w:spacing w:after="100" w:before="100"/>
       <w:ind w:firstLine="0" w:left="480" w:right="480"/>
+      <w:pBdr>
+        <w:left w:color="3B82F6" w:space="10" w:sz="22" w:val="single"/>
+      </w:pBdr>
+      <w:shd w:color="auto" w:fill="EFF4FF" w:val="clear"/>
     </w:pPr>
+    <w:rPr>
+      <w:color w:val="1E293B"/>
+    </w:rPr>
   </w:style>
   <w:style w:styleId="FootnoteText" w:type="paragraph">
     <w:name w:val="Footnote Text"/>

</xml_diff>